<commit_message>
feat (DPLAN-17476): typed exception hierarchy and messageBag error handling for template export
</commit_message>
<xml_diff>
--- a/demosplan/DemosPlanCoreBundle/Resources/public/files/statement_template_example_export.docx
+++ b/demosplan/DemosPlanCoreBundle/Resources/public/files/statement_template_example_export.docx
@@ -102,7 +102,6 @@
               </w:rPr>
               <w:t>Ihre Eingangsnummer: ${</w:t>
             </w:r>
-            <w:commentRangeStart w:id="0"/>
             <w:r>
               <w:rPr>
                 <w:bCs/>
@@ -117,10 +116,6 @@
                 <w:color w:themeColor="text1" w:val="000000"/>
                 <w:sz w:val="20"/>
               </w:rPr>
-            </w:r>
-            <w:commentRangeEnd w:id="0"/>
-            <w:r>
-              <w:commentReference w:id="0"/>
             </w:r>
             <w:r>
               <w:rPr>
@@ -423,28 +418,7 @@
 </file>
 
 <file path=word/comments.xml><?xml version="1.0" encoding="utf-8"?>
-<w:comments xmlns:o="urn:schemas-microsoft-com:office:office" xmlns:r="http://schemas.openxmlformats.org/officeDocument/2006/relationships" xmlns:v="urn:schemas-microsoft-com:vml" xmlns:w="http://schemas.openxmlformats.org/wordprocessingml/2006/main" xmlns:w10="urn:schemas-microsoft-com:office:word" xmlns:wp="http://schemas.openxmlformats.org/drawingml/2006/wordprocessingDrawing" xmlns:pic="http://schemas.openxmlformats.org/drawingml/2006/picture" xmlns:wps="http://schemas.microsoft.com/office/word/2010/wordprocessingShape" xmlns:wpg="http://schemas.microsoft.com/office/word/2010/wordprocessingGroup" xmlns:mc="http://schemas.openxmlformats.org/markup-compatibility/2006" xmlns:wp14="http://schemas.microsoft.com/office/word/2010/wordprocessingDrawing" xmlns:w14="http://schemas.microsoft.com/office/word/2010/wordml" xmlns:w15="http://schemas.microsoft.com/office/word/2012/wordml" mc:Ignorable="w14 wp14 w15">
-  <w:comment w:id="0" w:author="Jana Richter" w:date="2026-05-22T09:30:00Z" w:initials="JR">
-    <w:p>
-      <w:pPr>
-        <w:overflowPunct w:val="false"/>
-        <w:spacing w:before="0" w:after="0" w:lineRule="auto" w:line="240"/>
-        <w:rPr/>
-      </w:pPr>
-      <w:r>
-        <w:annotationRef/>
-      </w:r>
-      <w:r>
-        <w:rPr>
-          <w:rFonts w:ascii="Cambria" w:hAnsi="Cambria"/>
-          <w:sz w:val="20"/>
-          <w:szCs w:val="20"/>
-        </w:rPr>
-        <w:t>Die externe ID</w:t>
-      </w:r>
-    </w:p>
-  </w:comment>
-</w:comments>
+<w:comments xmlns:o="urn:schemas-microsoft-com:office:office" xmlns:r="http://schemas.openxmlformats.org/officeDocument/2006/relationships" xmlns:v="urn:schemas-microsoft-com:vml" xmlns:w="http://schemas.openxmlformats.org/wordprocessingml/2006/main" xmlns:w10="urn:schemas-microsoft-com:office:word" xmlns:wp="http://schemas.openxmlformats.org/drawingml/2006/wordprocessingDrawing" xmlns:pic="http://schemas.openxmlformats.org/drawingml/2006/picture" xmlns:wps="http://schemas.microsoft.com/office/word/2010/wordprocessingShape" xmlns:wpg="http://schemas.microsoft.com/office/word/2010/wordprocessingGroup" xmlns:mc="http://schemas.openxmlformats.org/markup-compatibility/2006" xmlns:wp14="http://schemas.microsoft.com/office/word/2010/wordprocessingDrawing" xmlns:w14="http://schemas.microsoft.com/office/word/2010/wordml" xmlns:w15="http://schemas.microsoft.com/office/word/2012/wordml" mc:Ignorable="w14 wp14 w15"/>
 </file>
 
 <file path=word/footer1.xml><?xml version="1.0" encoding="utf-8"?>

</xml_diff>